<commit_message>
Polish pilot copy and sample output
</commit_message>
<xml_diff>
--- a/public/sample/Northstar-Security-Overview.docx
+++ b/public/sample/Northstar-Security-Overview.docx
@@ -1493,7 +1493,7 @@
                 <w:color w:val="000000"/>
                 <w:sz w:val="17"/>
               </w:rPr>
-              <w:t>conflict regex matched NS-EV-002: (?i)15 minutes of inactivity</w:t>
+              <w:t>Available sources do not support one clear, current answer.</w:t>
             </w:r>
           </w:p>
         </w:tc>
@@ -1520,7 +1520,7 @@
                 <w:color w:val="000000"/>
                 <w:sz w:val="17"/>
               </w:rPr>
-              <w:t>Resolve the conflicting evidence and approve a single current source.</w:t>
+              <w:t>Reconcile the available sources and confirm one current answer.</w:t>
             </w:r>
           </w:p>
         </w:tc>
@@ -1576,7 +1576,7 @@
                 <w:color w:val="000000"/>
                 <w:sz w:val="17"/>
               </w:rPr>
-              <w:t>evidence NS-EV-003 is not current: evidence status is not approved; evidence expired on 2025-01-15; evidence is older than 365 days; conflict regex matched NS-EV-003: (?i)has not been reapproved</w:t>
+              <w:t>The supporting evidence is outdated or no longer approved.</w:t>
             </w:r>
           </w:p>
         </w:tc>
@@ -1603,7 +1603,7 @@
                 <w:color w:val="000000"/>
                 <w:sz w:val="17"/>
               </w:rPr>
-              <w:t>Resolve the conflicting evidence and approve a single current source.</w:t>
+              <w:t>Replace or reapprove the outdated source, then confirm the answer.</w:t>
             </w:r>
           </w:p>
         </w:tc>
@@ -1659,7 +1659,7 @@
                 <w:color w:val="000000"/>
                 <w:sz w:val="17"/>
               </w:rPr>
-              <w:t>no explicit approved claim matches this question</w:t>
+              <w:t>No approved, evidence-backed answer is available for this question.</w:t>
             </w:r>
           </w:p>
         </w:tc>
@@ -1686,7 +1686,7 @@
                 <w:color w:val="000000"/>
                 <w:sz w:val="17"/>
               </w:rPr>
-              <w:t>Add an explicitly approved claim with current evidence for this question.</w:t>
+              <w:t>Provide and approve current evidence for this question.</w:t>
             </w:r>
           </w:p>
         </w:tc>
@@ -1742,7 +1742,7 @@
                 <w:color w:val="000000"/>
                 <w:sz w:val="17"/>
               </w:rPr>
-              <w:t>no explicit approved claim matches this question</w:t>
+              <w:t>No approved, evidence-backed answer is available for this question.</w:t>
             </w:r>
           </w:p>
         </w:tc>
@@ -1769,7 +1769,7 @@
                 <w:color w:val="000000"/>
                 <w:sz w:val="17"/>
               </w:rPr>
-              <w:t>Add an explicitly approved claim with current evidence for this question.</w:t>
+              <w:t>Provide and approve current evidence for this question.</w:t>
             </w:r>
           </w:p>
         </w:tc>

</xml_diff>